<commit_message>
Modified seed to check for local minima during models optimization
</commit_message>
<xml_diff>
--- a/Resultados.docx
+++ b/Resultados.docx
@@ -52,10 +52,19 @@
     </w:p>
     <w:p>
       <w:r>
-        <w:t>De cara a modelar la recurrencia de FA</w:t>
-      </w:r>
-      <w:r>
-        <w:t xml:space="preserve">, se llevó a cabo una revisión bibliográfica para identificar qué variables clínicas aparecen con más frecuencia en </w:t>
+        <w:t>S</w:t>
+      </w:r>
+      <w:r>
+        <w:t>e llevó a cabo una revisión bibliográfica para identificar qué variables clínicas</w:t>
+      </w:r>
+      <w:r>
+        <w:t xml:space="preserve"> suelen considerarse</w:t>
+      </w:r>
+      <w:r>
+        <w:t xml:space="preserve"> en </w:t>
+      </w:r>
+      <w:r>
+        <w:t xml:space="preserve">los </w:t>
       </w:r>
       <w:proofErr w:type="spellStart"/>
       <w:r>
@@ -63,7 +72,7 @@
       </w:r>
       <w:proofErr w:type="spellEnd"/>
       <w:r>
-        <w:t xml:space="preserve"> scores habitualmente empleados por especialistas para caracterizar el riesgo de recurrencia de FA u otras patologías cardíacas relacionadas. En este sentido, se recopilaron todas las variables clínicas que aparecen en, al menos, uno de estos </w:t>
+        <w:t xml:space="preserve"> scores empleados por especialistas para caracterizar el riesgo de recurrencia de FA u otras patologías cardíacas relacionadas. En este sentido, se recopilaron todas las variables clínicas que aparecen en, al menos, uno de estos </w:t>
       </w:r>
       <w:proofErr w:type="spellStart"/>
       <w:r>
@@ -71,10 +80,28 @@
       </w:r>
       <w:proofErr w:type="spellEnd"/>
       <w:r>
-        <w:t xml:space="preserve"> scores. Las variables fueron ordenadas de mayor a menor frecuencia de aparición. También se agruparon </w:t>
-      </w:r>
-      <w:r>
-        <w:t>las variables en función de si están disponibles directamente en la base de datos o no.</w:t>
+        <w:t xml:space="preserve"> scores. Las variables fueron ordenadas de mayor a menor frecuencia de aparición</w:t>
+      </w:r>
+      <w:r>
+        <w:t xml:space="preserve"> y </w:t>
+      </w:r>
+      <w:r>
+        <w:t xml:space="preserve">se agruparon </w:t>
+      </w:r>
+      <w:r>
+        <w:t>en función de</w:t>
+      </w:r>
+      <w:r>
+        <w:t xml:space="preserve"> su disponibilidad</w:t>
+      </w:r>
+      <w:r>
+        <w:t xml:space="preserve"> directa</w:t>
+      </w:r>
+      <w:r>
+        <w:t xml:space="preserve"> </w:t>
+      </w:r>
+      <w:r>
+        <w:t>en la base de datos.</w:t>
       </w:r>
     </w:p>
     <w:p>
@@ -95,9 +122,122 @@
     </w:p>
     <w:p>
       <w:pPr>
+        <w:pStyle w:val="Ttulo2"/>
+      </w:pPr>
+      <w:r>
+        <w:t>Selección de variables</w:t>
+      </w:r>
+    </w:p>
+    <w:p>
+      <w:r>
+        <w:t xml:space="preserve">La tabla * recoge las variables encontradas en la revisión bibliográfica. Además, el gráfico * las muestra dichas variables ordenadas por frecuencia de aparición en los </w:t>
+      </w:r>
+      <w:proofErr w:type="spellStart"/>
+      <w:r>
+        <w:t>risk</w:t>
+      </w:r>
+      <w:proofErr w:type="spellEnd"/>
+      <w:r>
+        <w:t xml:space="preserve"> scores revisados y agrupadas según su disponibilidad en la base de datos del estudio.</w:t>
+      </w:r>
+    </w:p>
+    <w:p>
+      <w:r>
+        <w:rPr>
+          <w:noProof/>
+        </w:rPr>
+        <w:lastRenderedPageBreak/>
+        <w:drawing>
+          <wp:inline distT="0" distB="0" distL="0" distR="0" wp14:anchorId="68F6CE7D" wp14:editId="6E92EECD">
+            <wp:extent cx="5400040" cy="4199890"/>
+            <wp:effectExtent l="0" t="0" r="0" b="0"/>
+            <wp:docPr id="1140140236" name="Imagen 1"/>
+            <wp:cNvGraphicFramePr>
+              <a:graphicFrameLocks xmlns:a="http://schemas.openxmlformats.org/drawingml/2006/main" noChangeAspect="1"/>
+            </wp:cNvGraphicFramePr>
+            <a:graphic xmlns:a="http://schemas.openxmlformats.org/drawingml/2006/main">
+              <a:graphicData uri="http://schemas.openxmlformats.org/drawingml/2006/picture">
+                <pic:pic xmlns:pic="http://schemas.openxmlformats.org/drawingml/2006/picture">
+                  <pic:nvPicPr>
+                    <pic:cNvPr id="1140140236" name="Imagen 1140140236"/>
+                    <pic:cNvPicPr/>
+                  </pic:nvPicPr>
+                  <pic:blipFill>
+                    <a:blip r:embed="rId5" cstate="print">
+                      <a:extLst>
+                        <a:ext uri="{28A0092B-C50C-407E-A947-70E740481C1C}">
+                          <a14:useLocalDpi xmlns:a14="http://schemas.microsoft.com/office/drawing/2010/main" val="0"/>
+                        </a:ext>
+                      </a:extLst>
+                    </a:blip>
+                    <a:stretch>
+                      <a:fillRect/>
+                    </a:stretch>
+                  </pic:blipFill>
+                  <pic:spPr>
+                    <a:xfrm>
+                      <a:off x="0" y="0"/>
+                      <a:ext cx="5400040" cy="4199890"/>
+                    </a:xfrm>
+                    <a:prstGeom prst="rect">
+                      <a:avLst/>
+                    </a:prstGeom>
+                  </pic:spPr>
+                </pic:pic>
+              </a:graphicData>
+            </a:graphic>
+          </wp:inline>
+        </w:drawing>
+      </w:r>
+    </w:p>
+    <w:p>
+      <w:r>
+        <w:t xml:space="preserve">Según se observa en el gráfico, las variables mayormente incluidas en estos </w:t>
+      </w:r>
+      <w:proofErr w:type="spellStart"/>
+      <w:r>
+        <w:t>risk</w:t>
+      </w:r>
+      <w:proofErr w:type="spellEnd"/>
+      <w:r>
+        <w:t xml:space="preserve"> scores se encuentran disponibles en la base de datos</w:t>
+      </w:r>
+      <w:r>
+        <w:t>. No obstante, no todas están disponibles directamente. La más crítica es la tasa de filtrado glomerular estimada (</w:t>
+      </w:r>
+      <w:proofErr w:type="spellStart"/>
+      <w:r>
+        <w:t>eGFR</w:t>
+      </w:r>
+      <w:proofErr w:type="spellEnd"/>
+      <w:r>
+        <w:t xml:space="preserve">). Como esta variable caracteriza la función renal del paciente y en </w:t>
+      </w:r>
+      <w:proofErr w:type="spellStart"/>
+      <w:r>
+        <w:t>el</w:t>
+      </w:r>
+      <w:proofErr w:type="spellEnd"/>
+      <w:r>
+        <w:t xml:space="preserve"> estudio hay una variable binaria que lo hace de manera categórica (insuficiencia renal), se sustituyó </w:t>
+      </w:r>
+      <w:proofErr w:type="spellStart"/>
+      <w:r>
+        <w:t>eGFR</w:t>
+      </w:r>
+      <w:proofErr w:type="spellEnd"/>
+      <w:r>
+        <w:t xml:space="preserve"> por esta última.  La historia de FA aparece en la base de datos como una variable numérica: tiempo desde el diagnóstico de FA hasta la ablación con catéter. </w:t>
+      </w:r>
+    </w:p>
+    <w:p/>
+    <w:p/>
+    <w:p>
+      <w:pPr>
         <w:pStyle w:val="Ttulo1"/>
       </w:pPr>
       <w:r>
+        <w:lastRenderedPageBreak/>
         <w:t>Discusión</w:t>
       </w:r>
     </w:p>

</xml_diff>